<commit_message>
2.2.3-rasm dissertatsiyaga kiritildi: raqamli diagramma, qizil 5% chegara chizig‘i, sonlar jadvali; sahifalash
Co-Authored-By: Claude Opus 5.5 <noreply@anthropic.com>
Claude-Session: https://claude.ai/code/session_01PxHTC8Q7yHdrpAeUA5KUgM
</commit_message>
<xml_diff>
--- a/Namuna_2.2.3-rasm.docx
+++ b/Namuna_2.2.3-rasm.docx
@@ -648,10 +648,10 @@
             <w:r>
               <w:rPr>
                 <w:b/>
-                <w:color w:val="C00000"/>
+                <w:color w:val="FF0000"/>
                 <w:sz w:val="22"/>
               </w:rPr>
-              <w:t xml:space="preserve">╍╍ </w:t>
+              <w:t xml:space="preserve">━━ </w:t>
             </w:r>
             <w:r>
               <w:rPr>
@@ -762,7 +762,7 @@
         <w:rPr>
           <w:sz w:val="22"/>
         </w:rPr>
-        <w:t>Izoh: diagramma ostidagi jadvalda ko‘rsatkichlarning yil oxiridagi qiymatlari, foizda; qizil uzuq chiziq – 5 foizlik erta ogohlantirish chegarasi.</w:t>
+        <w:t>Izoh: diagramma ostidagi jadvalda ko‘rsatkichlarning yil oxiridagi qiymatlari, foizda; qizil chiziq – 5 foizlik erta ogohlantirish chegarasi.</w:t>
       </w:r>
     </w:p>
     <w:p>
@@ -25041,16 +25041,66 @@
             </c:strRef>
           </c:tx>
           <c:spPr>
-            <a:ln w="19050">
+            <a:ln w="34925">
               <a:solidFill>
-                <a:srgbClr val="C00000"/>
+                <a:srgbClr val="FF0000"/>
               </a:solidFill>
-              <a:prstDash val="sysDash"/>
             </a:ln>
           </c:spPr>
           <c:marker>
             <c:symbol val="none"/>
           </c:marker>
+          <c:dLbls>
+            <c:dLbl>
+              <c:idx val="2"/>
+              <c:tx>
+                <c:rich>
+                  <a:bodyPr wrap="none"/>
+                  <a:lstStyle/>
+                  <a:p>
+                    <a:pPr>
+                      <a:defRPr sz="1100" b="1">
+                        <a:solidFill>
+                          <a:srgbClr val="FF0000"/>
+                        </a:solidFill>
+                        <a:latin typeface="Times New Roman"/>
+                        <a:cs typeface="Times New Roman"/>
+                      </a:defRPr>
+                    </a:pPr>
+                    <a:r>
+                      <a:rPr lang="uz-Latn-UZ" sz="1100" b="1">
+                        <a:solidFill>
+                          <a:srgbClr val="FF0000"/>
+                        </a:solidFill>
+                        <a:latin typeface="Times New Roman"/>
+                        <a:cs typeface="Times New Roman"/>
+                      </a:rPr>
+                      <a:t>Erta ogohlantirish chegarasi (5 %)</a:t>
+                    </a:r>
+                  </a:p>
+                </c:rich>
+              </c:tx>
+              <c:spPr>
+                <a:noFill/>
+                <a:ln>
+                  <a:noFill/>
+                </a:ln>
+              </c:spPr>
+              <c:dLblPos val="t"/>
+              <c:showLegendKey val="0"/>
+              <c:showVal val="1"/>
+              <c:showCatName val="0"/>
+              <c:showSerName val="0"/>
+              <c:showPercent val="0"/>
+              <c:showBubbleSize val="0"/>
+            </c:dLbl>
+            <c:showLegendKey val="0"/>
+            <c:showVal val="0"/>
+            <c:showCatName val="0"/>
+            <c:showSerName val="0"/>
+            <c:showPercent val="0"/>
+            <c:showBubbleSize val="0"/>
+          </c:dLbls>
           <c:cat>
             <c:strRef>
               <c:f>Sheet1!$A$2:$A$6</c:f>

</xml_diff>